<commit_message>
Updated Bill of Materials for APCD and LPC
</commit_message>
<xml_diff>
--- a/pressure_encoder_documentation/lpc_雷射脈衝控制_manual.docx
+++ b/pressure_encoder_documentation/lpc_雷射脈衝控制_manual.docx
@@ -2904,6 +2904,16 @@
                 <w:color w:val="000000" w:themeColor="text1"/>
                 <w:lang w:val="en-US"/>
               </w:rPr>
+              <w:t>*</w:t>
+            </w:r>
+            <w:r>
+              <w:rPr>
+                <w:rFonts w:ascii="Times New Roman" w:hAnsi="Times New Roman" w:cs="Times New Roman"/>
+                <w:b/>
+                <w:bCs/>
+                <w:color w:val="000000" w:themeColor="text1"/>
+                <w:lang w:val="en-US"/>
+              </w:rPr>
               <w:t>/Units</w:t>
             </w:r>
           </w:p>
@@ -2985,7 +2995,7 @@
                 <w:color w:val="000000" w:themeColor="text1"/>
                 <w:lang w:val="en-US"/>
               </w:rPr>
-              <w:t>Web</w:t>
+              <w:t>Notes/Links</w:t>
             </w:r>
           </w:p>
         </w:tc>
@@ -3010,7 +3020,7 @@
                 <w:color w:val="000000" w:themeColor="text1"/>
                 <w:lang w:val="en-US"/>
               </w:rPr>
-              <w:t>…</w:t>
+              <w:t>Arduino UNO/NT$500/1 pcs</w:t>
             </w:r>
           </w:p>
         </w:tc>
@@ -3033,7 +3043,7 @@
                 <w:color w:val="000000" w:themeColor="text1"/>
                 <w:lang w:val="en-US"/>
               </w:rPr>
-              <w:t>…</w:t>
+              <w:t>Arduino</w:t>
             </w:r>
           </w:p>
         </w:tc>
@@ -3056,7 +3066,7 @@
                 <w:color w:val="000000" w:themeColor="text1"/>
                 <w:lang w:val="en-US"/>
               </w:rPr>
-              <w:t>…</w:t>
+              <w:t>None</w:t>
             </w:r>
           </w:p>
         </w:tc>
@@ -3079,7 +3089,304 @@
                 <w:color w:val="000000" w:themeColor="text1"/>
                 <w:lang w:val="en-US"/>
               </w:rPr>
-              <w:t>…</w:t>
+              <w:t>Arduino UNO</w:t>
+            </w:r>
+          </w:p>
+        </w:tc>
+      </w:tr>
+      <w:tr>
+        <w:tc>
+          <w:tcPr>
+            <w:tcW w:w="2972" w:type="dxa"/>
+          </w:tcPr>
+          <w:p>
+            <w:pPr>
+              <w:spacing w:line="276" w:lineRule="auto"/>
+              <w:rPr>
+                <w:rFonts w:ascii="Times New Roman" w:hAnsi="Times New Roman" w:cs="Times New Roman"/>
+                <w:color w:val="000000" w:themeColor="text1"/>
+              </w:rPr>
+            </w:pPr>
+            <w:r>
+              <w:rPr>
+                <w:rFonts w:ascii="Times New Roman" w:hAnsi="Times New Roman" w:cs="Times New Roman"/>
+                <w:color w:val="000000" w:themeColor="text1"/>
+              </w:rPr>
+              <w:t>Power delivery PCB**</w:t>
+            </w:r>
+          </w:p>
+          <w:p>
+            <w:pPr>
+              <w:spacing w:line="276" w:lineRule="auto"/>
+              <w:rPr>
+                <w:rFonts w:ascii="Times New Roman" w:hAnsi="Times New Roman" w:cs="Times New Roman"/>
+                <w:color w:val="000000" w:themeColor="text1"/>
+                <w:lang w:val="en-US"/>
+              </w:rPr>
+            </w:pPr>
+            <w:r>
+              <w:rPr>
+                <w:rFonts w:ascii="Times New Roman" w:hAnsi="Times New Roman" w:cs="Times New Roman"/>
+                <w:color w:val="000000" w:themeColor="text1"/>
+              </w:rPr>
+              <w:t>/US$25.84/5 pcs</w:t>
+            </w:r>
+          </w:p>
+        </w:tc>
+        <w:tc>
+          <w:tcPr>
+            <w:tcW w:w="2126" w:type="dxa"/>
+          </w:tcPr>
+          <w:p>
+            <w:pPr>
+              <w:spacing w:line="276" w:lineRule="auto"/>
+              <w:rPr>
+                <w:rFonts w:ascii="Times New Roman" w:hAnsi="Times New Roman" w:cs="Times New Roman"/>
+                <w:color w:val="000000" w:themeColor="text1"/>
+                <w:lang w:val="en-US"/>
+              </w:rPr>
+            </w:pPr>
+            <w:r>
+              <w:rPr>
+                <w:rFonts w:ascii="Times New Roman" w:hAnsi="Times New Roman" w:cs="Times New Roman"/>
+                <w:color w:val="000000" w:themeColor="text1"/>
+              </w:rPr>
+              <w:t>PCBWay</w:t>
+            </w:r>
+          </w:p>
+        </w:tc>
+        <w:tc>
+          <w:tcPr>
+            <w:tcW w:w="2127" w:type="dxa"/>
+          </w:tcPr>
+          <w:p>
+            <w:pPr>
+              <w:spacing w:line="276" w:lineRule="auto"/>
+              <w:rPr>
+                <w:rFonts w:ascii="Times New Roman" w:hAnsi="Times New Roman" w:cs="Times New Roman"/>
+                <w:color w:val="000000" w:themeColor="text1"/>
+                <w:lang w:val="en-US"/>
+              </w:rPr>
+            </w:pPr>
+            <w:hyperlink r:id="rId11" w:history="1">
+              <w:r>
+                <w:rPr>
+                  <w:rStyle w:val="Hyperlink"/>
+                  <w:rFonts w:ascii="Times New Roman" w:hAnsi="Times New Roman" w:cs="Times New Roman"/>
+                  <w:color w:val="000000" w:themeColor="text1"/>
+                </w:rPr>
+                <w:t>KiCad files</w:t>
+              </w:r>
+            </w:hyperlink>
+          </w:p>
+        </w:tc>
+        <w:tc>
+          <w:tcPr>
+            <w:tcW w:w="2125" w:type="dxa"/>
+          </w:tcPr>
+          <w:p>
+            <w:pPr>
+              <w:spacing w:line="276" w:lineRule="auto"/>
+              <w:rPr>
+                <w:rFonts w:ascii="Times New Roman" w:hAnsi="Times New Roman" w:cs="Times New Roman"/>
+                <w:color w:val="000000" w:themeColor="text1"/>
+                <w:lang w:val="en-US"/>
+              </w:rPr>
+            </w:pPr>
+            <w:hyperlink r:id="rId12" w:history="1">
+              <w:r>
+                <w:rPr>
+                  <w:rStyle w:val="Hyperlink"/>
+                  <w:rFonts w:ascii="Times New Roman" w:hAnsi="Times New Roman" w:cs="Times New Roman"/>
+                  <w:color w:val="000000" w:themeColor="text1"/>
+                </w:rPr>
+                <w:t>PCBWay</w:t>
+              </w:r>
+            </w:hyperlink>
+            <w:r>
+              <w:rPr>
+                <w:rFonts w:ascii="Times New Roman" w:hAnsi="Times New Roman" w:cs="Times New Roman"/>
+              </w:rPr>
+              <w:t xml:space="preserve"> (minimum order size of 5</w:t>
+            </w:r>
+            <w:r>
+              <w:rPr>
+                <w:rFonts w:ascii="Times New Roman" w:hAnsi="Times New Roman" w:cs="Times New Roman"/>
+              </w:rPr>
+              <w:t>, only 1 needed</w:t>
+            </w:r>
+            <w:r>
+              <w:rPr>
+                <w:rFonts w:ascii="Times New Roman" w:hAnsi="Times New Roman" w:cs="Times New Roman"/>
+              </w:rPr>
+              <w:t>)</w:t>
+            </w:r>
+          </w:p>
+        </w:tc>
+      </w:tr>
+      <w:tr>
+        <w:tc>
+          <w:tcPr>
+            <w:tcW w:w="2972" w:type="dxa"/>
+          </w:tcPr>
+          <w:p>
+            <w:pPr>
+              <w:spacing w:line="276" w:lineRule="auto"/>
+              <w:rPr>
+                <w:rFonts w:ascii="Times New Roman" w:hAnsi="Times New Roman" w:cs="Times New Roman"/>
+                <w:color w:val="000000" w:themeColor="text1"/>
+              </w:rPr>
+            </w:pPr>
+            <w:r>
+              <w:rPr>
+                <w:rFonts w:ascii="Times New Roman" w:hAnsi="Times New Roman" w:cs="Times New Roman"/>
+                <w:color w:val="000000" w:themeColor="text1"/>
+              </w:rPr>
+              <w:t>660 nm laser unit/NT$XX/1 pcs</w:t>
+            </w:r>
+          </w:p>
+        </w:tc>
+        <w:tc>
+          <w:tcPr>
+            <w:tcW w:w="2126" w:type="dxa"/>
+          </w:tcPr>
+          <w:p>
+            <w:pPr>
+              <w:spacing w:line="276" w:lineRule="auto"/>
+              <w:rPr>
+                <w:rFonts w:ascii="Times New Roman" w:hAnsi="Times New Roman" w:cs="Times New Roman"/>
+                <w:color w:val="000000" w:themeColor="text1"/>
+              </w:rPr>
+            </w:pPr>
+            <w:r>
+              <w:rPr>
+                <w:rFonts w:ascii="Times New Roman" w:hAnsi="Times New Roman" w:cs="Times New Roman"/>
+                <w:color w:val="000000" w:themeColor="text1"/>
+              </w:rPr>
+              <w:t>Generic</w:t>
+            </w:r>
+          </w:p>
+        </w:tc>
+        <w:tc>
+          <w:tcPr>
+            <w:tcW w:w="2127" w:type="dxa"/>
+          </w:tcPr>
+          <w:p>
+            <w:pPr>
+              <w:spacing w:line="276" w:lineRule="auto"/>
+              <w:rPr>
+                <w:rFonts w:ascii="Times New Roman" w:hAnsi="Times New Roman" w:cs="Times New Roman"/>
+              </w:rPr>
+            </w:pPr>
+            <w:r>
+              <w:rPr>
+                <w:rFonts w:ascii="Times New Roman" w:hAnsi="Times New Roman" w:cs="Times New Roman"/>
+              </w:rPr>
+              <w:t>None</w:t>
+            </w:r>
+          </w:p>
+        </w:tc>
+        <w:tc>
+          <w:tcPr>
+            <w:tcW w:w="2125" w:type="dxa"/>
+          </w:tcPr>
+          <w:p>
+            <w:pPr>
+              <w:spacing w:line="276" w:lineRule="auto"/>
+              <w:rPr>
+                <w:rFonts w:ascii="Times New Roman" w:hAnsi="Times New Roman" w:cs="Times New Roman"/>
+              </w:rPr>
+            </w:pPr>
+            <w:r>
+              <w:rPr>
+                <w:rFonts w:ascii="Times New Roman" w:hAnsi="Times New Roman" w:cs="Times New Roman"/>
+              </w:rPr>
+              <w:t>None</w:t>
+            </w:r>
+          </w:p>
+        </w:tc>
+      </w:tr>
+      <w:tr>
+        <w:tc>
+          <w:tcPr>
+            <w:tcW w:w="2972" w:type="dxa"/>
+          </w:tcPr>
+          <w:p>
+            <w:pPr>
+              <w:spacing w:line="276" w:lineRule="auto"/>
+              <w:rPr>
+                <w:rFonts w:ascii="Times New Roman" w:hAnsi="Times New Roman" w:cs="Times New Roman"/>
+                <w:color w:val="000000" w:themeColor="text1"/>
+              </w:rPr>
+            </w:pPr>
+            <w:r>
+              <w:rPr>
+                <w:rFonts w:ascii="Times New Roman" w:hAnsi="Times New Roman" w:cs="Times New Roman"/>
+                <w:color w:val="000000" w:themeColor="text1"/>
+              </w:rPr>
+              <w:t>2.1 mm barrel power supply, 12 V DC, center positive/NT$500/1 pcs</w:t>
+            </w:r>
+          </w:p>
+        </w:tc>
+        <w:tc>
+          <w:tcPr>
+            <w:tcW w:w="2126" w:type="dxa"/>
+          </w:tcPr>
+          <w:p>
+            <w:pPr>
+              <w:spacing w:line="276" w:lineRule="auto"/>
+              <w:rPr>
+                <w:rFonts w:ascii="Times New Roman" w:hAnsi="Times New Roman" w:cs="Times New Roman"/>
+                <w:color w:val="000000" w:themeColor="text1"/>
+              </w:rPr>
+            </w:pPr>
+            <w:r>
+              <w:rPr>
+                <w:rFonts w:ascii="Times New Roman" w:hAnsi="Times New Roman" w:cs="Times New Roman"/>
+                <w:color w:val="000000" w:themeColor="text1"/>
+              </w:rPr>
+              <w:t>Generic</w:t>
+            </w:r>
+          </w:p>
+        </w:tc>
+        <w:tc>
+          <w:tcPr>
+            <w:tcW w:w="2127" w:type="dxa"/>
+          </w:tcPr>
+          <w:p>
+            <w:pPr>
+              <w:spacing w:line="276" w:lineRule="auto"/>
+            </w:pPr>
+            <w:r>
+              <w:rPr>
+                <w:rFonts w:ascii="Times New Roman" w:hAnsi="Times New Roman" w:cs="Times New Roman"/>
+              </w:rPr>
+              <w:t>None</w:t>
+            </w:r>
+          </w:p>
+        </w:tc>
+        <w:tc>
+          <w:tcPr>
+            <w:tcW w:w="2125" w:type="dxa"/>
+          </w:tcPr>
+          <w:p>
+            <w:pPr>
+              <w:spacing w:line="276" w:lineRule="auto"/>
+              <w:rPr>
+                <w:rFonts w:ascii="Times New Roman" w:hAnsi="Times New Roman" w:cs="Times New Roman"/>
+              </w:rPr>
+            </w:pPr>
+            <w:r>
+              <w:rPr>
+                <w:rFonts w:ascii="Times New Roman" w:hAnsi="Times New Roman" w:cs="Times New Roman"/>
+              </w:rPr>
+              <w:t>Shared with OCT pressure device</w:t>
+            </w:r>
+            <w:r>
+              <w:rPr>
+                <w:rFonts w:ascii="Times New Roman" w:hAnsi="Times New Roman" w:cs="Times New Roman"/>
+              </w:rPr>
+              <w:t xml:space="preserve"> if used.</w:t>
             </w:r>
           </w:p>
         </w:tc>
@@ -3087,17 +3394,999 @@
     </w:tbl>
     <w:p>
       <w:pPr>
+        <w:spacing w:before="240" w:line="360" w:lineRule="auto"/>
+        <w:rPr>
+          <w:rFonts w:ascii="Times New Roman" w:hAnsi="Times New Roman" w:cs="Times New Roman"/>
+          <w:color w:val="000000" w:themeColor="text1"/>
+        </w:rPr>
+      </w:pPr>
+      <w:bookmarkStart w:id="4" w:name="_Ref218510629"/>
+      <w:r>
+        <w:rPr>
+          <w:rFonts w:ascii="Times New Roman" w:hAnsi="Times New Roman" w:cs="Times New Roman" w:hint="eastAsia"/>
+          <w:color w:val="000000" w:themeColor="text1"/>
+        </w:rPr>
+        <w:t>*Approximated cost of the item as a commodity part.</w:t>
+      </w:r>
+    </w:p>
+    <w:p>
+      <w:pPr>
         <w:spacing w:line="360" w:lineRule="auto"/>
         <w:rPr>
           <w:rFonts w:ascii="Times New Roman" w:hAnsi="Times New Roman" w:cs="Times New Roman"/>
           <w:color w:val="000000" w:themeColor="text1"/>
         </w:rPr>
       </w:pPr>
+      <w:r>
+        <w:rPr>
+          <w:rFonts w:ascii="Times New Roman" w:hAnsi="Times New Roman" w:cs="Times New Roman"/>
+          <w:color w:val="000000" w:themeColor="text1"/>
+        </w:rPr>
+        <w:t>** Bill of Materials for power delivery PCB assembly in</w:t>
+      </w:r>
+      <w:r>
+        <w:rPr>
+          <w:rFonts w:ascii="Times New Roman" w:hAnsi="Times New Roman" w:cs="Times New Roman"/>
+          <w:color w:val="000000" w:themeColor="text1"/>
+        </w:rPr>
+        <w:t xml:space="preserve"> </w:t>
+      </w:r>
+      <w:r>
+        <w:rPr>
+          <w:rFonts w:ascii="Times New Roman" w:hAnsi="Times New Roman" w:cs="Times New Roman"/>
+          <w:color w:val="000000" w:themeColor="text1"/>
+        </w:rPr>
+        <w:fldChar w:fldCharType="begin"/>
+      </w:r>
+      <w:r>
+        <w:rPr>
+          <w:rFonts w:ascii="Times New Roman" w:hAnsi="Times New Roman" w:cs="Times New Roman"/>
+          <w:color w:val="000000" w:themeColor="text1"/>
+        </w:rPr>
+        <w:instrText xml:space="preserve"> REF _Ref218510681 \h </w:instrText>
+      </w:r>
+      <w:r>
+        <w:rPr>
+          <w:rFonts w:ascii="Times New Roman" w:hAnsi="Times New Roman" w:cs="Times New Roman"/>
+          <w:color w:val="000000" w:themeColor="text1"/>
+        </w:rPr>
+      </w:r>
+      <w:r>
+        <w:rPr>
+          <w:rFonts w:ascii="Times New Roman" w:hAnsi="Times New Roman" w:cs="Times New Roman"/>
+          <w:color w:val="000000" w:themeColor="text1"/>
+        </w:rPr>
+        <w:fldChar w:fldCharType="separate"/>
+      </w:r>
+      <w:r>
+        <w:rPr>
+          <w:rFonts w:ascii="Times New Roman" w:hAnsi="Times New Roman" w:cs="Times New Roman"/>
+          <w:color w:val="000000" w:themeColor="text1"/>
+        </w:rPr>
+        <w:t xml:space="preserve">Table </w:t>
+      </w:r>
+      <w:r>
+        <w:rPr>
+          <w:rFonts w:ascii="Times New Roman" w:hAnsi="Times New Roman" w:cs="Times New Roman"/>
+          <w:noProof/>
+          <w:color w:val="000000" w:themeColor="text1"/>
+        </w:rPr>
+        <w:t>2</w:t>
+      </w:r>
+      <w:r>
+        <w:rPr>
+          <w:rFonts w:ascii="Times New Roman" w:hAnsi="Times New Roman" w:cs="Times New Roman"/>
+          <w:color w:val="000000" w:themeColor="text1"/>
+        </w:rPr>
+        <w:fldChar w:fldCharType="end"/>
+      </w:r>
+      <w:r>
+        <w:rPr>
+          <w:rFonts w:ascii="Times New Roman" w:hAnsi="Times New Roman" w:cs="Times New Roman"/>
+          <w:color w:val="000000" w:themeColor="text1"/>
+        </w:rPr>
+        <w:t>.</w:t>
+      </w:r>
+    </w:p>
+    <w:p>
+      <w:pPr>
+        <w:pStyle w:val="Caption"/>
+        <w:keepNext/>
+        <w:jc w:val="center"/>
+        <w:rPr>
+          <w:rFonts w:ascii="Times New Roman" w:hAnsi="Times New Roman" w:cs="Times New Roman"/>
+          <w:color w:val="000000" w:themeColor="text1"/>
+          <w:sz w:val="24"/>
+          <w:szCs w:val="24"/>
+        </w:rPr>
+      </w:pPr>
+      <w:bookmarkStart w:id="5" w:name="_Ref218510681"/>
+      <w:r>
+        <w:rPr>
+          <w:rFonts w:ascii="Times New Roman" w:hAnsi="Times New Roman" w:cs="Times New Roman"/>
+          <w:color w:val="000000" w:themeColor="text1"/>
+          <w:sz w:val="24"/>
+          <w:szCs w:val="24"/>
+        </w:rPr>
+        <w:t xml:space="preserve">Table </w:t>
+      </w:r>
+      <w:r>
+        <w:rPr>
+          <w:rFonts w:ascii="Times New Roman" w:hAnsi="Times New Roman" w:cs="Times New Roman"/>
+          <w:color w:val="000000" w:themeColor="text1"/>
+          <w:sz w:val="24"/>
+          <w:szCs w:val="24"/>
+        </w:rPr>
+        <w:fldChar w:fldCharType="begin"/>
+      </w:r>
+      <w:r>
+        <w:rPr>
+          <w:rFonts w:ascii="Times New Roman" w:hAnsi="Times New Roman" w:cs="Times New Roman"/>
+          <w:color w:val="000000" w:themeColor="text1"/>
+          <w:sz w:val="24"/>
+          <w:szCs w:val="24"/>
+        </w:rPr>
+        <w:instrText xml:space="preserve"> SEQ Table \* ARABIC </w:instrText>
+      </w:r>
+      <w:r>
+        <w:rPr>
+          <w:rFonts w:ascii="Times New Roman" w:hAnsi="Times New Roman" w:cs="Times New Roman"/>
+          <w:color w:val="000000" w:themeColor="text1"/>
+          <w:sz w:val="24"/>
+          <w:szCs w:val="24"/>
+        </w:rPr>
+        <w:fldChar w:fldCharType="separate"/>
+      </w:r>
+      <w:r>
+        <w:rPr>
+          <w:rFonts w:ascii="Times New Roman" w:hAnsi="Times New Roman" w:cs="Times New Roman"/>
+          <w:noProof/>
+          <w:color w:val="000000" w:themeColor="text1"/>
+          <w:sz w:val="24"/>
+          <w:szCs w:val="24"/>
+        </w:rPr>
+        <w:t>2</w:t>
+      </w:r>
+      <w:r>
+        <w:rPr>
+          <w:rFonts w:ascii="Times New Roman" w:hAnsi="Times New Roman" w:cs="Times New Roman"/>
+          <w:color w:val="000000" w:themeColor="text1"/>
+          <w:sz w:val="24"/>
+          <w:szCs w:val="24"/>
+        </w:rPr>
+        <w:fldChar w:fldCharType="end"/>
+      </w:r>
+      <w:bookmarkEnd w:id="4"/>
+      <w:bookmarkEnd w:id="5"/>
+      <w:r>
+        <w:rPr>
+          <w:rFonts w:ascii="Times New Roman" w:hAnsi="Times New Roman" w:cs="Times New Roman"/>
+          <w:color w:val="000000" w:themeColor="text1"/>
+          <w:sz w:val="24"/>
+          <w:szCs w:val="24"/>
+        </w:rPr>
+        <w:t>: Bill of Materials for power delivery PCB.</w:t>
+      </w:r>
+    </w:p>
+    <w:tbl>
+      <w:tblPr>
+        <w:tblStyle w:val="TableGrid"/>
+        <w:tblW w:w="0" w:type="auto"/>
+        <w:tblLook w:val="04A0" w:firstRow="1" w:lastRow="0" w:firstColumn="1" w:lastColumn="0" w:noHBand="0" w:noVBand="1"/>
+      </w:tblPr>
+      <w:tblGrid>
+        <w:gridCol w:w="2972"/>
+        <w:gridCol w:w="2126"/>
+        <w:gridCol w:w="2127"/>
+        <w:gridCol w:w="2125"/>
+      </w:tblGrid>
+      <w:tr>
+        <w:tc>
+          <w:tcPr>
+            <w:tcW w:w="2972" w:type="dxa"/>
+          </w:tcPr>
+          <w:p>
+            <w:pPr>
+              <w:spacing w:line="276" w:lineRule="auto"/>
+              <w:rPr>
+                <w:rFonts w:ascii="Times New Roman" w:hAnsi="Times New Roman" w:cs="Times New Roman"/>
+                <w:b/>
+                <w:bCs/>
+                <w:color w:val="000000" w:themeColor="text1"/>
+              </w:rPr>
+            </w:pPr>
+            <w:r>
+              <w:rPr>
+                <w:rFonts w:ascii="Times New Roman" w:hAnsi="Times New Roman" w:cs="Times New Roman"/>
+                <w:b/>
+                <w:bCs/>
+                <w:color w:val="000000" w:themeColor="text1"/>
+              </w:rPr>
+              <w:t>Part name/Cost</w:t>
+            </w:r>
+            <w:r>
+              <w:rPr>
+                <w:rFonts w:ascii="Times New Roman" w:hAnsi="Times New Roman" w:cs="Times New Roman" w:hint="eastAsia"/>
+                <w:b/>
+                <w:bCs/>
+                <w:color w:val="000000" w:themeColor="text1"/>
+              </w:rPr>
+              <w:t>*</w:t>
+            </w:r>
+            <w:r>
+              <w:rPr>
+                <w:rFonts w:ascii="Times New Roman" w:hAnsi="Times New Roman" w:cs="Times New Roman"/>
+                <w:b/>
+                <w:bCs/>
+                <w:color w:val="000000" w:themeColor="text1"/>
+              </w:rPr>
+              <w:t>/Units</w:t>
+            </w:r>
+          </w:p>
+        </w:tc>
+        <w:tc>
+          <w:tcPr>
+            <w:tcW w:w="2126" w:type="dxa"/>
+          </w:tcPr>
+          <w:p>
+            <w:pPr>
+              <w:spacing w:line="276" w:lineRule="auto"/>
+              <w:rPr>
+                <w:rFonts w:ascii="Times New Roman" w:hAnsi="Times New Roman" w:cs="Times New Roman"/>
+                <w:b/>
+                <w:bCs/>
+                <w:color w:val="000000" w:themeColor="text1"/>
+              </w:rPr>
+            </w:pPr>
+            <w:r>
+              <w:rPr>
+                <w:rFonts w:ascii="Times New Roman" w:hAnsi="Times New Roman" w:cs="Times New Roman"/>
+                <w:b/>
+                <w:bCs/>
+                <w:color w:val="000000" w:themeColor="text1"/>
+              </w:rPr>
+              <w:t>Manufacturer</w:t>
+            </w:r>
+          </w:p>
+        </w:tc>
+        <w:tc>
+          <w:tcPr>
+            <w:tcW w:w="2127" w:type="dxa"/>
+          </w:tcPr>
+          <w:p>
+            <w:pPr>
+              <w:spacing w:line="276" w:lineRule="auto"/>
+              <w:rPr>
+                <w:rFonts w:ascii="Times New Roman" w:hAnsi="Times New Roman" w:cs="Times New Roman"/>
+                <w:b/>
+                <w:bCs/>
+                <w:color w:val="000000" w:themeColor="text1"/>
+              </w:rPr>
+            </w:pPr>
+            <w:r>
+              <w:rPr>
+                <w:rFonts w:ascii="Times New Roman" w:hAnsi="Times New Roman" w:cs="Times New Roman"/>
+                <w:b/>
+                <w:bCs/>
+                <w:color w:val="000000" w:themeColor="text1"/>
+              </w:rPr>
+              <w:t>Resources</w:t>
+            </w:r>
+          </w:p>
+        </w:tc>
+        <w:tc>
+          <w:tcPr>
+            <w:tcW w:w="2125" w:type="dxa"/>
+          </w:tcPr>
+          <w:p>
+            <w:pPr>
+              <w:spacing w:line="276" w:lineRule="auto"/>
+              <w:rPr>
+                <w:rFonts w:ascii="Times New Roman" w:hAnsi="Times New Roman" w:cs="Times New Roman"/>
+                <w:b/>
+                <w:bCs/>
+                <w:color w:val="000000" w:themeColor="text1"/>
+              </w:rPr>
+            </w:pPr>
+            <w:r>
+              <w:rPr>
+                <w:rFonts w:ascii="Times New Roman" w:hAnsi="Times New Roman" w:cs="Times New Roman"/>
+                <w:b/>
+                <w:bCs/>
+                <w:color w:val="000000" w:themeColor="text1"/>
+              </w:rPr>
+              <w:t>Notes/Links</w:t>
+            </w:r>
+          </w:p>
+        </w:tc>
+      </w:tr>
+      <w:tr>
+        <w:tc>
+          <w:tcPr>
+            <w:tcW w:w="2972" w:type="dxa"/>
+          </w:tcPr>
+          <w:p>
+            <w:pPr>
+              <w:spacing w:line="276" w:lineRule="auto"/>
+              <w:rPr>
+                <w:rFonts w:ascii="Times New Roman" w:hAnsi="Times New Roman" w:cs="Times New Roman"/>
+                <w:color w:val="000000" w:themeColor="text1"/>
+              </w:rPr>
+            </w:pPr>
+            <w:r>
+              <w:rPr>
+                <w:rFonts w:ascii="Times New Roman" w:hAnsi="Times New Roman" w:cs="Times New Roman"/>
+                <w:color w:val="000000" w:themeColor="text1"/>
+              </w:rPr>
+              <w:t>Pololu DRV8825 stepper motor driver/NT$100/1 pcs</w:t>
+            </w:r>
+          </w:p>
+        </w:tc>
+        <w:tc>
+          <w:tcPr>
+            <w:tcW w:w="2126" w:type="dxa"/>
+          </w:tcPr>
+          <w:p>
+            <w:pPr>
+              <w:spacing w:line="276" w:lineRule="auto"/>
+              <w:rPr>
+                <w:rFonts w:ascii="Times New Roman" w:hAnsi="Times New Roman" w:cs="Times New Roman"/>
+                <w:color w:val="000000" w:themeColor="text1"/>
+              </w:rPr>
+            </w:pPr>
+            <w:r>
+              <w:rPr>
+                <w:rFonts w:ascii="Times New Roman" w:hAnsi="Times New Roman" w:cs="Times New Roman"/>
+                <w:color w:val="000000" w:themeColor="text1"/>
+              </w:rPr>
+              <w:t>Pololu/Generic</w:t>
+            </w:r>
+          </w:p>
+        </w:tc>
+        <w:tc>
+          <w:tcPr>
+            <w:tcW w:w="2127" w:type="dxa"/>
+          </w:tcPr>
+          <w:p>
+            <w:pPr>
+              <w:spacing w:line="276" w:lineRule="auto"/>
+              <w:rPr>
+                <w:rFonts w:ascii="Times New Roman" w:hAnsi="Times New Roman" w:cs="Times New Roman"/>
+                <w:color w:val="000000" w:themeColor="text1"/>
+              </w:rPr>
+            </w:pPr>
+            <w:hyperlink r:id="rId13" w:history="1">
+              <w:r>
+                <w:rPr>
+                  <w:rStyle w:val="Hyperlink"/>
+                  <w:rFonts w:ascii="Times New Roman" w:hAnsi="Times New Roman" w:cs="Times New Roman"/>
+                  <w:color w:val="000000" w:themeColor="text1"/>
+                </w:rPr>
+                <w:t>Purchase location</w:t>
+              </w:r>
+            </w:hyperlink>
+          </w:p>
+        </w:tc>
+        <w:tc>
+          <w:tcPr>
+            <w:tcW w:w="2125" w:type="dxa"/>
+          </w:tcPr>
+          <w:p>
+            <w:pPr>
+              <w:spacing w:line="276" w:lineRule="auto"/>
+              <w:rPr>
+                <w:rFonts w:ascii="Times New Roman" w:hAnsi="Times New Roman" w:cs="Times New Roman"/>
+                <w:color w:val="000000" w:themeColor="text1"/>
+              </w:rPr>
+            </w:pPr>
+            <w:hyperlink r:id="rId14" w:history="1">
+              <w:r>
+                <w:rPr>
+                  <w:rStyle w:val="Hyperlink"/>
+                  <w:rFonts w:ascii="Times New Roman" w:hAnsi="Times New Roman" w:cs="Times New Roman"/>
+                  <w:color w:val="000000" w:themeColor="text1"/>
+                </w:rPr>
+                <w:t>Pololu</w:t>
+              </w:r>
+            </w:hyperlink>
+          </w:p>
+        </w:tc>
+      </w:tr>
+      <w:tr>
+        <w:tc>
+          <w:tcPr>
+            <w:tcW w:w="2972" w:type="dxa"/>
+          </w:tcPr>
+          <w:p>
+            <w:pPr>
+              <w:spacing w:line="276" w:lineRule="auto"/>
+              <w:rPr>
+                <w:rFonts w:ascii="Times New Roman" w:hAnsi="Times New Roman" w:cs="Times New Roman"/>
+                <w:color w:val="000000" w:themeColor="text1"/>
+              </w:rPr>
+            </w:pPr>
+            <w:r>
+              <w:rPr>
+                <w:rFonts w:ascii="Times New Roman" w:hAnsi="Times New Roman" w:cs="Times New Roman"/>
+                <w:color w:val="000000" w:themeColor="text1"/>
+              </w:rPr>
+              <w:t>CFSensor 6847A analog pressure sensor unit/NT$115/1 pcs</w:t>
+            </w:r>
+          </w:p>
+        </w:tc>
+        <w:tc>
+          <w:tcPr>
+            <w:tcW w:w="2126" w:type="dxa"/>
+          </w:tcPr>
+          <w:p>
+            <w:pPr>
+              <w:spacing w:line="276" w:lineRule="auto"/>
+              <w:rPr>
+                <w:rFonts w:ascii="Times New Roman" w:hAnsi="Times New Roman" w:cs="Times New Roman"/>
+                <w:color w:val="000000" w:themeColor="text1"/>
+              </w:rPr>
+            </w:pPr>
+            <w:r>
+              <w:rPr>
+                <w:rFonts w:ascii="Times New Roman" w:hAnsi="Times New Roman" w:cs="Times New Roman"/>
+                <w:color w:val="000000" w:themeColor="text1"/>
+              </w:rPr>
+              <w:t>CFSensor/Generic</w:t>
+            </w:r>
+          </w:p>
+        </w:tc>
+        <w:tc>
+          <w:tcPr>
+            <w:tcW w:w="2127" w:type="dxa"/>
+          </w:tcPr>
+          <w:p>
+            <w:pPr>
+              <w:spacing w:line="276" w:lineRule="auto"/>
+              <w:rPr>
+                <w:rFonts w:ascii="Times New Roman" w:hAnsi="Times New Roman" w:cs="Times New Roman"/>
+                <w:color w:val="000000" w:themeColor="text1"/>
+              </w:rPr>
+            </w:pPr>
+            <w:hyperlink r:id="rId15" w:history="1">
+              <w:r>
+                <w:rPr>
+                  <w:rStyle w:val="Hyperlink"/>
+                  <w:rFonts w:ascii="Times New Roman" w:hAnsi="Times New Roman" w:cs="Times New Roman"/>
+                  <w:color w:val="000000" w:themeColor="text1"/>
+                </w:rPr>
+                <w:t>Purchase page (Shopee)</w:t>
+              </w:r>
+            </w:hyperlink>
+          </w:p>
+        </w:tc>
+        <w:tc>
+          <w:tcPr>
+            <w:tcW w:w="2125" w:type="dxa"/>
+          </w:tcPr>
+          <w:p>
+            <w:pPr>
+              <w:spacing w:line="276" w:lineRule="auto"/>
+              <w:rPr>
+                <w:rFonts w:ascii="Times New Roman" w:hAnsi="Times New Roman" w:cs="Times New Roman"/>
+                <w:color w:val="000000" w:themeColor="text1"/>
+              </w:rPr>
+            </w:pPr>
+            <w:r>
+              <w:rPr>
+                <w:rFonts w:ascii="Times New Roman" w:hAnsi="Times New Roman" w:cs="Times New Roman"/>
+                <w:color w:val="000000" w:themeColor="text1"/>
+              </w:rPr>
+              <w:t>Source from online.</w:t>
+            </w:r>
+          </w:p>
+        </w:tc>
+      </w:tr>
+      <w:tr>
+        <w:tc>
+          <w:tcPr>
+            <w:tcW w:w="2972" w:type="dxa"/>
+          </w:tcPr>
+          <w:p>
+            <w:pPr>
+              <w:spacing w:line="276" w:lineRule="auto"/>
+              <w:rPr>
+                <w:rFonts w:ascii="Times New Roman" w:hAnsi="Times New Roman" w:cs="Times New Roman"/>
+                <w:color w:val="000000" w:themeColor="text1"/>
+              </w:rPr>
+            </w:pPr>
+            <w:r>
+              <w:rPr>
+                <w:rFonts w:ascii="Times New Roman" w:hAnsi="Times New Roman" w:cs="Times New Roman"/>
+                <w:color w:val="000000" w:themeColor="text1"/>
+              </w:rPr>
+              <w:t>TIP120 power transistor/NT$30/1 pcs</w:t>
+            </w:r>
+          </w:p>
+        </w:tc>
+        <w:tc>
+          <w:tcPr>
+            <w:tcW w:w="2126" w:type="dxa"/>
+          </w:tcPr>
+          <w:p>
+            <w:pPr>
+              <w:spacing w:line="276" w:lineRule="auto"/>
+              <w:rPr>
+                <w:rFonts w:ascii="Times New Roman" w:hAnsi="Times New Roman" w:cs="Times New Roman"/>
+                <w:color w:val="000000" w:themeColor="text1"/>
+              </w:rPr>
+            </w:pPr>
+            <w:r>
+              <w:rPr>
+                <w:rFonts w:ascii="Times New Roman" w:hAnsi="Times New Roman" w:cs="Times New Roman"/>
+                <w:color w:val="000000" w:themeColor="text1"/>
+              </w:rPr>
+              <w:t>Generic</w:t>
+            </w:r>
+          </w:p>
+        </w:tc>
+        <w:tc>
+          <w:tcPr>
+            <w:tcW w:w="2127" w:type="dxa"/>
+          </w:tcPr>
+          <w:p>
+            <w:pPr>
+              <w:spacing w:line="276" w:lineRule="auto"/>
+              <w:rPr>
+                <w:rFonts w:ascii="Times New Roman" w:hAnsi="Times New Roman" w:cs="Times New Roman"/>
+                <w:color w:val="000000" w:themeColor="text1"/>
+              </w:rPr>
+            </w:pPr>
+            <w:hyperlink r:id="rId16" w:history="1">
+              <w:r>
+                <w:rPr>
+                  <w:rStyle w:val="Hyperlink"/>
+                  <w:rFonts w:ascii="Times New Roman" w:hAnsi="Times New Roman" w:cs="Times New Roman"/>
+                  <w:color w:val="000000" w:themeColor="text1"/>
+                </w:rPr>
+                <w:t>Purchase location</w:t>
+              </w:r>
+            </w:hyperlink>
+          </w:p>
+        </w:tc>
+        <w:tc>
+          <w:tcPr>
+            <w:tcW w:w="2125" w:type="dxa"/>
+          </w:tcPr>
+          <w:p>
+            <w:pPr>
+              <w:spacing w:line="276" w:lineRule="auto"/>
+              <w:rPr>
+                <w:rFonts w:ascii="Times New Roman" w:hAnsi="Times New Roman" w:cs="Times New Roman"/>
+                <w:color w:val="000000" w:themeColor="text1"/>
+              </w:rPr>
+            </w:pPr>
+            <w:r>
+              <w:rPr>
+                <w:rFonts w:ascii="Times New Roman" w:hAnsi="Times New Roman" w:cs="Times New Roman"/>
+                <w:color w:val="000000" w:themeColor="text1"/>
+              </w:rPr>
+              <w:t>Used to switch solenoid power.</w:t>
+            </w:r>
+          </w:p>
+        </w:tc>
+      </w:tr>
+      <w:tr>
+        <w:tc>
+          <w:tcPr>
+            <w:tcW w:w="2972" w:type="dxa"/>
+          </w:tcPr>
+          <w:p>
+            <w:pPr>
+              <w:spacing w:line="276" w:lineRule="auto"/>
+              <w:rPr>
+                <w:rFonts w:ascii="Times New Roman" w:hAnsi="Times New Roman" w:cs="Times New Roman"/>
+                <w:color w:val="000000" w:themeColor="text1"/>
+                <w:u w:val="single"/>
+              </w:rPr>
+            </w:pPr>
+            <w:r>
+              <w:rPr>
+                <w:rFonts w:ascii="Times New Roman" w:hAnsi="Times New Roman" w:cs="Times New Roman"/>
+                <w:color w:val="000000" w:themeColor="text1"/>
+              </w:rPr>
+              <w:t>100 µF 35 V electrolytic capacitor/NT$10/1 pcs</w:t>
+            </w:r>
+          </w:p>
+        </w:tc>
+        <w:tc>
+          <w:tcPr>
+            <w:tcW w:w="2126" w:type="dxa"/>
+          </w:tcPr>
+          <w:p>
+            <w:pPr>
+              <w:spacing w:line="276" w:lineRule="auto"/>
+              <w:rPr>
+                <w:rFonts w:ascii="Times New Roman" w:hAnsi="Times New Roman" w:cs="Times New Roman"/>
+                <w:color w:val="000000" w:themeColor="text1"/>
+              </w:rPr>
+            </w:pPr>
+            <w:r>
+              <w:rPr>
+                <w:rFonts w:ascii="Times New Roman" w:hAnsi="Times New Roman" w:cs="Times New Roman"/>
+                <w:color w:val="000000" w:themeColor="text1"/>
+              </w:rPr>
+              <w:t>Generic</w:t>
+            </w:r>
+          </w:p>
+        </w:tc>
+        <w:tc>
+          <w:tcPr>
+            <w:tcW w:w="2127" w:type="dxa"/>
+          </w:tcPr>
+          <w:p>
+            <w:pPr>
+              <w:spacing w:line="276" w:lineRule="auto"/>
+              <w:rPr>
+                <w:rFonts w:ascii="Times New Roman" w:hAnsi="Times New Roman" w:cs="Times New Roman"/>
+                <w:color w:val="000000" w:themeColor="text1"/>
+              </w:rPr>
+            </w:pPr>
+            <w:hyperlink r:id="rId17" w:history="1">
+              <w:r>
+                <w:rPr>
+                  <w:rStyle w:val="Hyperlink"/>
+                  <w:rFonts w:ascii="Times New Roman" w:hAnsi="Times New Roman" w:cs="Times New Roman"/>
+                  <w:color w:val="000000" w:themeColor="text1"/>
+                </w:rPr>
+                <w:t>Purchase location</w:t>
+              </w:r>
+            </w:hyperlink>
+          </w:p>
+        </w:tc>
+        <w:tc>
+          <w:tcPr>
+            <w:tcW w:w="2125" w:type="dxa"/>
+          </w:tcPr>
+          <w:p>
+            <w:pPr>
+              <w:spacing w:line="276" w:lineRule="auto"/>
+              <w:rPr>
+                <w:rFonts w:ascii="Times New Roman" w:hAnsi="Times New Roman" w:cs="Times New Roman"/>
+                <w:color w:val="000000" w:themeColor="text1"/>
+              </w:rPr>
+            </w:pPr>
+            <w:r>
+              <w:rPr>
+                <w:rFonts w:ascii="Times New Roman" w:hAnsi="Times New Roman" w:cs="Times New Roman"/>
+                <w:color w:val="000000" w:themeColor="text1"/>
+              </w:rPr>
+              <w:t>Smoothing capacitor for DRV8825 12 V.</w:t>
+            </w:r>
+          </w:p>
+        </w:tc>
+      </w:tr>
+      <w:tr>
+        <w:tc>
+          <w:tcPr>
+            <w:tcW w:w="2972" w:type="dxa"/>
+          </w:tcPr>
+          <w:p>
+            <w:pPr>
+              <w:spacing w:line="276" w:lineRule="auto"/>
+              <w:rPr>
+                <w:rFonts w:ascii="Times New Roman" w:hAnsi="Times New Roman" w:cs="Times New Roman"/>
+                <w:color w:val="000000" w:themeColor="text1"/>
+              </w:rPr>
+            </w:pPr>
+            <w:r>
+              <w:rPr>
+                <w:rFonts w:ascii="Times New Roman" w:hAnsi="Times New Roman" w:cs="Times New Roman"/>
+                <w:color w:val="000000" w:themeColor="text1"/>
+              </w:rPr>
+              <w:t>5 mm LED/NT$10/2 pcs</w:t>
+            </w:r>
+          </w:p>
+        </w:tc>
+        <w:tc>
+          <w:tcPr>
+            <w:tcW w:w="2126" w:type="dxa"/>
+          </w:tcPr>
+          <w:p>
+            <w:pPr>
+              <w:spacing w:line="276" w:lineRule="auto"/>
+              <w:rPr>
+                <w:rFonts w:ascii="Times New Roman" w:hAnsi="Times New Roman" w:cs="Times New Roman"/>
+                <w:color w:val="000000" w:themeColor="text1"/>
+              </w:rPr>
+            </w:pPr>
+            <w:r>
+              <w:rPr>
+                <w:rFonts w:ascii="Times New Roman" w:hAnsi="Times New Roman" w:cs="Times New Roman"/>
+                <w:color w:val="000000" w:themeColor="text1"/>
+              </w:rPr>
+              <w:t>Generic</w:t>
+            </w:r>
+          </w:p>
+        </w:tc>
+        <w:tc>
+          <w:tcPr>
+            <w:tcW w:w="2127" w:type="dxa"/>
+          </w:tcPr>
+          <w:p>
+            <w:pPr>
+              <w:spacing w:line="276" w:lineRule="auto"/>
+              <w:rPr>
+                <w:rFonts w:ascii="Times New Roman" w:hAnsi="Times New Roman" w:cs="Times New Roman"/>
+                <w:color w:val="000000" w:themeColor="text1"/>
+              </w:rPr>
+            </w:pPr>
+            <w:hyperlink r:id="rId18" w:history="1">
+              <w:r>
+                <w:rPr>
+                  <w:rStyle w:val="Hyperlink"/>
+                  <w:rFonts w:ascii="Times New Roman" w:hAnsi="Times New Roman" w:cs="Times New Roman"/>
+                  <w:color w:val="000000" w:themeColor="text1"/>
+                </w:rPr>
+                <w:t>Purchase location</w:t>
+              </w:r>
+            </w:hyperlink>
+          </w:p>
+        </w:tc>
+        <w:tc>
+          <w:tcPr>
+            <w:tcW w:w="2125" w:type="dxa"/>
+          </w:tcPr>
+          <w:p>
+            <w:pPr>
+              <w:spacing w:line="276" w:lineRule="auto"/>
+              <w:rPr>
+                <w:rFonts w:ascii="Times New Roman" w:hAnsi="Times New Roman" w:cs="Times New Roman"/>
+                <w:color w:val="000000" w:themeColor="text1"/>
+              </w:rPr>
+            </w:pPr>
+            <w:r>
+              <w:rPr>
+                <w:rFonts w:ascii="Times New Roman" w:hAnsi="Times New Roman" w:cs="Times New Roman"/>
+                <w:color w:val="000000" w:themeColor="text1"/>
+              </w:rPr>
+              <w:t>1 red (motor fault), 1 green (12 V power).</w:t>
+            </w:r>
+          </w:p>
+        </w:tc>
+      </w:tr>
+      <w:tr>
+        <w:tc>
+          <w:tcPr>
+            <w:tcW w:w="2972" w:type="dxa"/>
+          </w:tcPr>
+          <w:p>
+            <w:pPr>
+              <w:spacing w:line="276" w:lineRule="auto"/>
+              <w:rPr>
+                <w:rFonts w:ascii="Times New Roman" w:hAnsi="Times New Roman" w:cs="Times New Roman"/>
+                <w:color w:val="000000" w:themeColor="text1"/>
+              </w:rPr>
+            </w:pPr>
+            <w:r>
+              <w:rPr>
+                <w:rFonts w:ascii="Times New Roman" w:hAnsi="Times New Roman" w:cs="Times New Roman"/>
+                <w:color w:val="000000" w:themeColor="text1"/>
+              </w:rPr>
+              <w:t>1N4007 power diode/NT$10/1 pcs</w:t>
+            </w:r>
+          </w:p>
+        </w:tc>
+        <w:tc>
+          <w:tcPr>
+            <w:tcW w:w="2126" w:type="dxa"/>
+          </w:tcPr>
+          <w:p>
+            <w:pPr>
+              <w:spacing w:line="276" w:lineRule="auto"/>
+              <w:rPr>
+                <w:rFonts w:ascii="Times New Roman" w:hAnsi="Times New Roman" w:cs="Times New Roman"/>
+                <w:color w:val="000000" w:themeColor="text1"/>
+              </w:rPr>
+            </w:pPr>
+            <w:r>
+              <w:rPr>
+                <w:rFonts w:ascii="Times New Roman" w:hAnsi="Times New Roman" w:cs="Times New Roman"/>
+                <w:color w:val="000000" w:themeColor="text1"/>
+              </w:rPr>
+              <w:t>Generic</w:t>
+            </w:r>
+          </w:p>
+        </w:tc>
+        <w:tc>
+          <w:tcPr>
+            <w:tcW w:w="2127" w:type="dxa"/>
+          </w:tcPr>
+          <w:p>
+            <w:pPr>
+              <w:spacing w:line="276" w:lineRule="auto"/>
+              <w:rPr>
+                <w:rFonts w:ascii="Times New Roman" w:hAnsi="Times New Roman" w:cs="Times New Roman"/>
+                <w:color w:val="000000" w:themeColor="text1"/>
+              </w:rPr>
+            </w:pPr>
+            <w:hyperlink r:id="rId19" w:history="1">
+              <w:r>
+                <w:rPr>
+                  <w:rStyle w:val="Hyperlink"/>
+                  <w:rFonts w:ascii="Times New Roman" w:hAnsi="Times New Roman" w:cs="Times New Roman"/>
+                  <w:color w:val="000000" w:themeColor="text1"/>
+                </w:rPr>
+                <w:t>Purchase location</w:t>
+              </w:r>
+            </w:hyperlink>
+          </w:p>
+        </w:tc>
+        <w:tc>
+          <w:tcPr>
+            <w:tcW w:w="2125" w:type="dxa"/>
+          </w:tcPr>
+          <w:p>
+            <w:pPr>
+              <w:spacing w:line="276" w:lineRule="auto"/>
+              <w:rPr>
+                <w:rFonts w:ascii="Times New Roman" w:hAnsi="Times New Roman" w:cs="Times New Roman"/>
+                <w:color w:val="000000" w:themeColor="text1"/>
+              </w:rPr>
+            </w:pPr>
+            <w:r>
+              <w:rPr>
+                <w:rFonts w:ascii="Times New Roman" w:hAnsi="Times New Roman" w:cs="Times New Roman"/>
+                <w:color w:val="000000" w:themeColor="text1"/>
+              </w:rPr>
+              <w:t>Flyback diode for solenoid valve.</w:t>
+            </w:r>
+          </w:p>
+        </w:tc>
+      </w:tr>
+      <w:tr>
+        <w:tc>
+          <w:tcPr>
+            <w:tcW w:w="2972" w:type="dxa"/>
+          </w:tcPr>
+          <w:p>
+            <w:pPr>
+              <w:spacing w:line="276" w:lineRule="auto"/>
+              <w:rPr>
+                <w:rFonts w:ascii="Times New Roman" w:hAnsi="Times New Roman" w:cs="Times New Roman"/>
+                <w:color w:val="000000" w:themeColor="text1"/>
+              </w:rPr>
+            </w:pPr>
+            <w:r>
+              <w:rPr>
+                <w:rFonts w:ascii="Times New Roman" w:hAnsi="Times New Roman" w:cs="Times New Roman"/>
+                <w:color w:val="000000" w:themeColor="text1"/>
+              </w:rPr>
+              <w:lastRenderedPageBreak/>
+              <w:t>1.5 kΩ resistor/NT$5/2 pcs</w:t>
+            </w:r>
+          </w:p>
+        </w:tc>
+        <w:tc>
+          <w:tcPr>
+            <w:tcW w:w="2126" w:type="dxa"/>
+          </w:tcPr>
+          <w:p>
+            <w:pPr>
+              <w:spacing w:line="276" w:lineRule="auto"/>
+              <w:rPr>
+                <w:rFonts w:ascii="Times New Roman" w:hAnsi="Times New Roman" w:cs="Times New Roman"/>
+                <w:color w:val="000000" w:themeColor="text1"/>
+              </w:rPr>
+            </w:pPr>
+            <w:r>
+              <w:rPr>
+                <w:rFonts w:ascii="Times New Roman" w:hAnsi="Times New Roman" w:cs="Times New Roman"/>
+                <w:color w:val="000000" w:themeColor="text1"/>
+              </w:rPr>
+              <w:t>Generic</w:t>
+            </w:r>
+          </w:p>
+        </w:tc>
+        <w:tc>
+          <w:tcPr>
+            <w:tcW w:w="2127" w:type="dxa"/>
+          </w:tcPr>
+          <w:p>
+            <w:pPr>
+              <w:spacing w:line="276" w:lineRule="auto"/>
+              <w:rPr>
+                <w:rFonts w:ascii="Times New Roman" w:hAnsi="Times New Roman" w:cs="Times New Roman"/>
+                <w:color w:val="000000" w:themeColor="text1"/>
+              </w:rPr>
+            </w:pPr>
+            <w:hyperlink r:id="rId20" w:history="1">
+              <w:r>
+                <w:rPr>
+                  <w:rStyle w:val="Hyperlink"/>
+                  <w:rFonts w:ascii="Times New Roman" w:hAnsi="Times New Roman" w:cs="Times New Roman"/>
+                  <w:color w:val="000000" w:themeColor="text1"/>
+                </w:rPr>
+                <w:t>Purchase location</w:t>
+              </w:r>
+            </w:hyperlink>
+          </w:p>
+        </w:tc>
+        <w:tc>
+          <w:tcPr>
+            <w:tcW w:w="2125" w:type="dxa"/>
+          </w:tcPr>
+          <w:p>
+            <w:pPr>
+              <w:spacing w:line="276" w:lineRule="auto"/>
+              <w:rPr>
+                <w:rFonts w:ascii="Times New Roman" w:hAnsi="Times New Roman" w:cs="Times New Roman"/>
+                <w:color w:val="000000" w:themeColor="text1"/>
+              </w:rPr>
+            </w:pPr>
+            <w:r>
+              <w:rPr>
+                <w:rFonts w:ascii="Times New Roman" w:hAnsi="Times New Roman" w:cs="Times New Roman"/>
+                <w:color w:val="000000" w:themeColor="text1"/>
+              </w:rPr>
+              <w:t xml:space="preserve">Only one visible in </w:t>
+            </w:r>
+            <w:r>
+              <w:rPr>
+                <w:rFonts w:ascii="Times New Roman" w:hAnsi="Times New Roman" w:cs="Times New Roman"/>
+                <w:color w:val="000000" w:themeColor="text1"/>
+              </w:rPr>
+              <w:fldChar w:fldCharType="begin"/>
+            </w:r>
+            <w:r>
+              <w:rPr>
+                <w:rFonts w:ascii="Times New Roman" w:hAnsi="Times New Roman" w:cs="Times New Roman"/>
+                <w:color w:val="000000" w:themeColor="text1"/>
+              </w:rPr>
+              <w:instrText xml:space="preserve"> REF _Ref218506058 \h </w:instrText>
+            </w:r>
+            <w:r>
+              <w:rPr>
+                <w:rFonts w:ascii="Times New Roman" w:hAnsi="Times New Roman" w:cs="Times New Roman"/>
+                <w:color w:val="000000" w:themeColor="text1"/>
+              </w:rPr>
+              <w:fldChar w:fldCharType="separate"/>
+            </w:r>
+            <w:r>
+              <w:rPr>
+                <w:rFonts w:ascii="Times New Roman" w:hAnsi="Times New Roman" w:cs="Times New Roman"/>
+                <w:b/>
+                <w:bCs/>
+                <w:color w:val="000000" w:themeColor="text1"/>
+                <w:lang w:val="en-US"/>
+              </w:rPr>
+              <w:t>Error! Reference source not found.</w:t>
+            </w:r>
+            <w:r>
+              <w:rPr>
+                <w:rFonts w:ascii="Times New Roman" w:hAnsi="Times New Roman" w:cs="Times New Roman"/>
+                <w:color w:val="000000" w:themeColor="text1"/>
+              </w:rPr>
+              <w:fldChar w:fldCharType="end"/>
+            </w:r>
+            <w:r>
+              <w:rPr>
+                <w:rFonts w:ascii="Times New Roman" w:hAnsi="Times New Roman" w:cs="Times New Roman"/>
+                <w:color w:val="000000" w:themeColor="text1"/>
+              </w:rPr>
+              <w:t>; Rev B adds a pull-up resistor to 5 V power on DRV8825’s reset pin.</w:t>
+            </w:r>
+          </w:p>
+        </w:tc>
+      </w:tr>
+    </w:tbl>
+    <w:p>
+      <w:pPr>
+        <w:spacing w:line="360" w:lineRule="auto"/>
+        <w:rPr>
+          <w:rFonts w:ascii="Times New Roman" w:hAnsi="Times New Roman" w:cs="Times New Roman"/>
+          <w:color w:val="000000" w:themeColor="text1"/>
+        </w:rPr>
+      </w:pPr>
     </w:p>
     <w:sectPr>
-      <w:headerReference w:type="default" r:id="rId11"/>
-      <w:footerReference w:type="even" r:id="rId12"/>
-      <w:footerReference w:type="default" r:id="rId13"/>
+      <w:headerReference w:type="default" r:id="rId21"/>
+      <w:footerReference w:type="even" r:id="rId22"/>
+      <w:footerReference w:type="default" r:id="rId23"/>
       <w:pgSz w:w="12240" w:h="15840"/>
       <w:pgMar w:top="1440" w:right="1440" w:bottom="1440" w:left="1440" w:header="708" w:footer="708" w:gutter="0"/>
       <w:pgNumType w:start="0"/>

</xml_diff>